<commit_message>
Menu updates from the diner; repo review and reorganisation
Content (canvas, PDFs, Word): two-price items labelled half/full, drink
prices added (tea 2.50, orange juice and milk 3.00, soda 3.00), kids'
chicken strips tagged hand-breaded.

Repo: README rewritten around the regular menu and how the system
works (canvas master, print PDF, Word copy), what's where, how to
change it, settled decisions and open questions. Seasonal PDFs, art and
bands moved under seasonal/ folders. render.py now runs from the repo
(repo logo paths, fonts via tools/package.json); Word build gains
make-fonts.py and repo-relative usage. Style guide updated to match.
Canvas now opens on the regular menu.

Co-Authored-By: Claude Opus 5.5 <noreply@anthropic.com>
Claude-Session: https://claude.ai/code/session_01RKLL92XzQ2FsxZ7BA8qdpK
</commit_message>
<xml_diff>
--- a/word/TKB Diner Menu.docx
+++ b/word/TKB Diner Menu.docx
@@ -286,7 +286,7 @@
                 <w:sz w:val="27"/>
                 <w:szCs w:val="27"/>
               </w:rPr>
-              <w:t xml:space="preserve">4 / 7</w:t>
+              <w:t xml:space="preserve">half 4 · full 7</w:t>
             </w:r>
           </w:p>
           <w:p>
@@ -2894,7 +2894,7 @@
                 <w:sz w:val="27"/>
                 <w:szCs w:val="27"/>
               </w:rPr>
-              <w:t xml:space="preserve">9 / 11</w:t>
+              <w:t xml:space="preserve">half 9 · full 11</w:t>
             </w:r>
           </w:p>
           <w:p>
@@ -2952,7 +2952,7 @@
                 <w:sz w:val="27"/>
                 <w:szCs w:val="27"/>
               </w:rPr>
-              <w:t xml:space="preserve">10 / 12</w:t>
+              <w:t xml:space="preserve">half 10 · full 12</w:t>
             </w:r>
           </w:p>
           <w:p>
@@ -3010,7 +3010,7 @@
                 <w:sz w:val="27"/>
                 <w:szCs w:val="27"/>
               </w:rPr>
-              <w:t xml:space="preserve">10 / 12</w:t>
+              <w:t xml:space="preserve">half 10 · full 12</w:t>
             </w:r>
           </w:p>
           <w:p>
@@ -3068,7 +3068,7 @@
                 <w:sz w:val="27"/>
                 <w:szCs w:val="27"/>
               </w:rPr>
-              <w:t xml:space="preserve">10 / 12</w:t>
+              <w:t xml:space="preserve">half 10 · full 12</w:t>
             </w:r>
           </w:p>
           <w:p>
@@ -6147,7 +6147,7 @@
                 <w:sz w:val="27"/>
                 <w:szCs w:val="27"/>
               </w:rPr>
-              <w:t xml:space="preserve">9 / 12</w:t>
+              <w:t xml:space="preserve">half 9 · full 12</w:t>
             </w:r>
           </w:p>
           <w:p>
@@ -6205,7 +6205,7 @@
                 <w:sz w:val="27"/>
                 <w:szCs w:val="27"/>
               </w:rPr>
-              <w:t xml:space="preserve">9 / 12</w:t>
+              <w:t xml:space="preserve">half 9 · full 12</w:t>
             </w:r>
           </w:p>
           <w:p>
@@ -6263,7 +6263,7 @@
                 <w:sz w:val="27"/>
                 <w:szCs w:val="27"/>
               </w:rPr>
-              <w:t xml:space="preserve">9 / 12</w:t>
+              <w:t xml:space="preserve">half 9 · full 12</w:t>
             </w:r>
           </w:p>
           <w:p>
@@ -6787,43 +6787,60 @@
           </w:p>
           <w:p>
             <w:pPr>
-              <w:keepNext w:val="false"/>
+              <w:keepNext/>
               <w:keepLines/>
               <w:tabs>
                 <w:tab w:val="right" w:pos="4930" w:leader="dot"/>
               </w:tabs>
+              <w:spacing w:after="20" w:before="0" w:line="240" w:lineRule="auto"/>
+            </w:pPr>
+            <w:r>
+              <w:rPr>
+                <w:rFonts w:ascii="Zilla Slab SemiBold" w:cs="Zilla Slab SemiBold" w:eastAsia="Zilla Slab SemiBold" w:hAnsi="Zilla Slab SemiBold"/>
+                <w:b w:val="false"/>
+                <w:bCs w:val="false"/>
+                <w:color w:val="2A1E18"/>
+                <w:sz w:val="27"/>
+                <w:szCs w:val="27"/>
+              </w:rPr>
+              <w:t xml:space="preserve">Chicken Strips (2)</w:t>
+            </w:r>
+            <w:r>
+              <w:rPr>
+                <w:rFonts w:ascii="Libre Franklin" w:cs="Libre Franklin" w:eastAsia="Libre Franklin" w:hAnsi="Libre Franklin"/>
+                <w:color w:val="B9A68F"/>
+                <w:sz w:val="20"/>
+                <w:szCs w:val="20"/>
+              </w:rPr>
+              <w:t xml:space="preserve">	</w:t>
+            </w:r>
+            <w:r>
+              <w:rPr>
+                <w:rFonts w:ascii="Zilla Slab Bold" w:cs="Zilla Slab Bold" w:eastAsia="Zilla Slab Bold" w:hAnsi="Zilla Slab Bold"/>
+                <w:b w:val="false"/>
+                <w:bCs w:val="false"/>
+                <w:color w:val="8A2A2B"/>
+                <w:sz w:val="27"/>
+                <w:szCs w:val="27"/>
+              </w:rPr>
+              <w:t xml:space="preserve">8</w:t>
+            </w:r>
+          </w:p>
+          <w:p>
+            <w:pPr>
+              <w:keepLines/>
               <w:spacing w:after="250" w:before="0" w:line="240" w:lineRule="auto"/>
             </w:pPr>
             <w:r>
               <w:rPr>
-                <w:rFonts w:ascii="Zilla Slab SemiBold" w:cs="Zilla Slab SemiBold" w:eastAsia="Zilla Slab SemiBold" w:hAnsi="Zilla Slab SemiBold"/>
-                <w:b w:val="false"/>
-                <w:bCs w:val="false"/>
-                <w:color w:val="2A1E18"/>
-                <w:sz w:val="27"/>
-                <w:szCs w:val="27"/>
-              </w:rPr>
-              <w:t xml:space="preserve">Chicken Strips (2)</w:t>
-            </w:r>
-            <w:r>
-              <w:rPr>
-                <w:rFonts w:ascii="Libre Franklin" w:cs="Libre Franklin" w:eastAsia="Libre Franklin" w:hAnsi="Libre Franklin"/>
-                <w:color w:val="B9A68F"/>
-                <w:sz w:val="20"/>
-                <w:szCs w:val="20"/>
-              </w:rPr>
-              <w:t xml:space="preserve">	</w:t>
-            </w:r>
-            <w:r>
-              <w:rPr>
-                <w:rFonts w:ascii="Zilla Slab Bold" w:cs="Zilla Slab Bold" w:eastAsia="Zilla Slab Bold" w:hAnsi="Zilla Slab Bold"/>
+                <w:rFonts w:ascii="Libre Franklin SemiBold" w:cs="Libre Franklin SemiBold" w:eastAsia="Libre Franklin SemiBold" w:hAnsi="Libre Franklin SemiBold"/>
                 <w:b w:val="false"/>
                 <w:bCs w:val="false"/>
                 <w:color w:val="8A2A2B"/>
-                <w:sz w:val="27"/>
-                <w:szCs w:val="27"/>
-              </w:rPr>
-              <w:t xml:space="preserve">8</w:t>
+                <w:sz w:val="20"/>
+                <w:szCs w:val="20"/>
+              </w:rPr>
+              <w:t xml:space="preserve">Hand-breaded to order</w:t>
             </w:r>
           </w:p>
           <w:p>
@@ -7293,7 +7310,7 @@
                 <w:sz w:val="27"/>
                 <w:szCs w:val="27"/>
               </w:rPr>
-              <w:t xml:space="preserve">3</w:t>
+              <w:t xml:space="preserve">3.00</w:t>
             </w:r>
           </w:p>
           <w:p>
@@ -7315,6 +7332,129 @@
           </w:p>
           <w:p>
             <w:pPr>
+              <w:keepNext w:val="false"/>
+              <w:keepLines/>
+              <w:tabs>
+                <w:tab w:val="right" w:pos="4930" w:leader="dot"/>
+              </w:tabs>
+              <w:spacing w:after="250" w:before="0" w:line="240" w:lineRule="auto"/>
+            </w:pPr>
+            <w:r>
+              <w:rPr>
+                <w:rFonts w:ascii="Zilla Slab SemiBold" w:cs="Zilla Slab SemiBold" w:eastAsia="Zilla Slab SemiBold" w:hAnsi="Zilla Slab SemiBold"/>
+                <w:b w:val="false"/>
+                <w:bCs w:val="false"/>
+                <w:color w:val="2A1E18"/>
+                <w:sz w:val="27"/>
+                <w:szCs w:val="27"/>
+              </w:rPr>
+              <w:t xml:space="preserve">Tea, iced or hot</w:t>
+            </w:r>
+            <w:r>
+              <w:rPr>
+                <w:rFonts w:ascii="Libre Franklin" w:cs="Libre Franklin" w:eastAsia="Libre Franklin" w:hAnsi="Libre Franklin"/>
+                <w:color w:val="B9A68F"/>
+                <w:sz w:val="20"/>
+                <w:szCs w:val="20"/>
+              </w:rPr>
+              <w:t xml:space="preserve">	</w:t>
+            </w:r>
+            <w:r>
+              <w:rPr>
+                <w:rFonts w:ascii="Zilla Slab Bold" w:cs="Zilla Slab Bold" w:eastAsia="Zilla Slab Bold" w:hAnsi="Zilla Slab Bold"/>
+                <w:b w:val="false"/>
+                <w:bCs w:val="false"/>
+                <w:color w:val="8A2A2B"/>
+                <w:sz w:val="27"/>
+                <w:szCs w:val="27"/>
+              </w:rPr>
+              <w:t xml:space="preserve">2.50</w:t>
+            </w:r>
+          </w:p>
+          <w:p>
+            <w:pPr>
+              <w:keepNext w:val="false"/>
+              <w:keepLines/>
+              <w:tabs>
+                <w:tab w:val="right" w:pos="4930" w:leader="dot"/>
+              </w:tabs>
+              <w:spacing w:after="250" w:before="0" w:line="240" w:lineRule="auto"/>
+            </w:pPr>
+            <w:r>
+              <w:rPr>
+                <w:rFonts w:ascii="Zilla Slab SemiBold" w:cs="Zilla Slab SemiBold" w:eastAsia="Zilla Slab SemiBold" w:hAnsi="Zilla Slab SemiBold"/>
+                <w:b w:val="false"/>
+                <w:bCs w:val="false"/>
+                <w:color w:val="2A1E18"/>
+                <w:sz w:val="27"/>
+                <w:szCs w:val="27"/>
+              </w:rPr>
+              <w:t xml:space="preserve">Orange juice</w:t>
+            </w:r>
+            <w:r>
+              <w:rPr>
+                <w:rFonts w:ascii="Libre Franklin" w:cs="Libre Franklin" w:eastAsia="Libre Franklin" w:hAnsi="Libre Franklin"/>
+                <w:color w:val="B9A68F"/>
+                <w:sz w:val="20"/>
+                <w:szCs w:val="20"/>
+              </w:rPr>
+              <w:t xml:space="preserve">	</w:t>
+            </w:r>
+            <w:r>
+              <w:rPr>
+                <w:rFonts w:ascii="Zilla Slab Bold" w:cs="Zilla Slab Bold" w:eastAsia="Zilla Slab Bold" w:hAnsi="Zilla Slab Bold"/>
+                <w:b w:val="false"/>
+                <w:bCs w:val="false"/>
+                <w:color w:val="8A2A2B"/>
+                <w:sz w:val="27"/>
+                <w:szCs w:val="27"/>
+              </w:rPr>
+              <w:t xml:space="preserve">3.00</w:t>
+            </w:r>
+          </w:p>
+          <w:p>
+            <w:pPr>
+              <w:keepNext w:val="false"/>
+              <w:keepLines/>
+              <w:tabs>
+                <w:tab w:val="right" w:pos="4930" w:leader="dot"/>
+              </w:tabs>
+              <w:spacing w:after="250" w:before="0" w:line="240" w:lineRule="auto"/>
+            </w:pPr>
+            <w:r>
+              <w:rPr>
+                <w:rFonts w:ascii="Zilla Slab SemiBold" w:cs="Zilla Slab SemiBold" w:eastAsia="Zilla Slab SemiBold" w:hAnsi="Zilla Slab SemiBold"/>
+                <w:b w:val="false"/>
+                <w:bCs w:val="false"/>
+                <w:color w:val="2A1E18"/>
+                <w:sz w:val="27"/>
+                <w:szCs w:val="27"/>
+              </w:rPr>
+              <w:t xml:space="preserve">Milk</w:t>
+            </w:r>
+            <w:r>
+              <w:rPr>
+                <w:rFonts w:ascii="Libre Franklin" w:cs="Libre Franklin" w:eastAsia="Libre Franklin" w:hAnsi="Libre Franklin"/>
+                <w:color w:val="B9A68F"/>
+                <w:sz w:val="20"/>
+                <w:szCs w:val="20"/>
+              </w:rPr>
+              <w:t xml:space="preserve">	</w:t>
+            </w:r>
+            <w:r>
+              <w:rPr>
+                <w:rFonts w:ascii="Zilla Slab Bold" w:cs="Zilla Slab Bold" w:eastAsia="Zilla Slab Bold" w:hAnsi="Zilla Slab Bold"/>
+                <w:b w:val="false"/>
+                <w:bCs w:val="false"/>
+                <w:color w:val="8A2A2B"/>
+                <w:sz w:val="27"/>
+                <w:szCs w:val="27"/>
+              </w:rPr>
+              <w:t xml:space="preserve">3.00</w:t>
+            </w:r>
+          </w:p>
+          <w:p>
+            <w:pPr>
               <w:keepLines/>
               <w:spacing w:after="110" w:before="0" w:line="240" w:lineRule="auto"/>
             </w:pPr>
@@ -7327,7 +7467,7 @@
                 <w:sz w:val="20"/>
                 <w:szCs w:val="20"/>
               </w:rPr>
-              <w:t xml:space="preserve">Also: iced tea, hot tea, coffee, milk, orange juice, water</w:t>
+              <w:t xml:space="preserve">Also: coffee and water</w:t>
             </w:r>
           </w:p>
           <w:p>

</xml_diff>

<commit_message>
Coffee 2.50, Starry, 1000 Island, breakfast served all day
Settles the diner's open questions: coffee priced, tea one price iced or hot,
1000 Island spelling, Starry replaces Sierra Mist, hours stay off. Cover and
breakfast page now say breakfast is served all day. Canvas, PDFs, Word file
and style guide updated together.

Co-Authored-By: Claude Opus 5.5 <noreply@anthropic.com>
Claude-Session: https://claude.ai/code/session_01RKLL92XzQ2FsxZ7BA8qdpK
</commit_message>
<xml_diff>
--- a/word/TKB Diner Menu.docx
+++ b/word/TKB Diner Menu.docx
@@ -90,7 +90,25 @@
     <w:p>
       <w:pPr>
         <w:keepLines/>
-        <w:spacing w:after="40" w:before="760" w:line="240" w:lineRule="auto"/>
+        <w:spacing w:after="0" w:before="90" w:line="240" w:lineRule="auto"/>
+        <w:jc w:val="center"/>
+      </w:pPr>
+      <w:r>
+        <w:rPr>
+          <w:rFonts w:ascii="Zilla Slab SemiBold" w:cs="Zilla Slab SemiBold" w:eastAsia="Zilla Slab SemiBold" w:hAnsi="Zilla Slab SemiBold"/>
+          <w:b w:val="false"/>
+          <w:bCs w:val="false"/>
+          <w:color w:val="2A1E18"/>
+          <w:sz w:val="33"/>
+          <w:szCs w:val="33"/>
+        </w:rPr>
+        <w:t xml:space="preserve">Breakfast served all day</w:t>
+      </w:r>
+    </w:p>
+    <w:p>
+      <w:pPr>
+        <w:keepLines/>
+        <w:spacing w:after="40" w:before="540" w:line="240" w:lineRule="auto"/>
         <w:jc w:val="center"/>
       </w:pPr>
       <w:r>
@@ -175,6 +193,9 @@
     <w:p>
       <w:pPr>
         <w:keepLines/>
+        <w:tabs>
+          <w:tab w:val="right" w:pos="10540" w:leader="none"/>
+        </w:tabs>
         <w:spacing w:after="360" w:before="0" w:line="240" w:lineRule="auto"/>
       </w:pPr>
       <w:r>
@@ -187,6 +208,22 @@
           <w:szCs w:val="81"/>
         </w:rPr>
         <w:t xml:space="preserve">Classic Breakfast</w:t>
+      </w:r>
+      <w:r>
+        <w:t xml:space="preserve">	</w:t>
+      </w:r>
+      <w:r>
+        <w:rPr>
+          <w:rFonts w:ascii="Libre Franklin SemiBold" w:cs="Libre Franklin SemiBold" w:eastAsia="Libre Franklin SemiBold" w:hAnsi="Libre Franklin SemiBold"/>
+          <w:b w:val="false"/>
+          <w:bCs w:val="false"/>
+          <w:caps/>
+          <w:color w:val="2E6A68"/>
+          <w:spacing w:val="40"/>
+          <w:sz w:val="20"/>
+          <w:szCs w:val="20"/>
+        </w:rPr>
+        <w:t xml:space="preserve">Served all day</w:t>
       </w:r>
     </w:p>
     <w:tbl>
@@ -6353,7 +6390,7 @@
                       <w:sz w:val="20"/>
                       <w:szCs w:val="20"/>
                     </w:rPr>
-                    <w:t xml:space="preserve">Homemade ranch · Blue cheese · Raspberry vinaigrette · Dorothy Lynch · Italian · Thousand Island · Honey mustard</w:t>
+                    <w:t xml:space="preserve">Homemade ranch · Blue cheese · Raspberry vinaigrette · Dorothy Lynch · Italian · 1000 Island · Honey mustard</w:t>
                   </w:r>
                 </w:p>
               </w:tc>
@@ -7327,7 +7364,7 @@
                 <w:sz w:val="20"/>
                 <w:szCs w:val="20"/>
               </w:rPr>
-              <w:t xml:space="preserve">24 oz with unlimited refills · Pepsi, Diet Pepsi, Mountain Dew, Dr Pepper, Sierra Mist</w:t>
+              <w:t xml:space="preserve">24 oz with unlimited refills · Pepsi, Diet Pepsi, Mountain Dew, Dr Pepper, Starry</w:t>
             </w:r>
           </w:p>
           <w:p>
@@ -7455,6 +7492,47 @@
           </w:p>
           <w:p>
             <w:pPr>
+              <w:keepNext w:val="false"/>
+              <w:keepLines/>
+              <w:tabs>
+                <w:tab w:val="right" w:pos="4930" w:leader="dot"/>
+              </w:tabs>
+              <w:spacing w:after="250" w:before="0" w:line="240" w:lineRule="auto"/>
+            </w:pPr>
+            <w:r>
+              <w:rPr>
+                <w:rFonts w:ascii="Zilla Slab SemiBold" w:cs="Zilla Slab SemiBold" w:eastAsia="Zilla Slab SemiBold" w:hAnsi="Zilla Slab SemiBold"/>
+                <w:b w:val="false"/>
+                <w:bCs w:val="false"/>
+                <w:color w:val="2A1E18"/>
+                <w:sz w:val="27"/>
+                <w:szCs w:val="27"/>
+              </w:rPr>
+              <w:t xml:space="preserve">Coffee</w:t>
+            </w:r>
+            <w:r>
+              <w:rPr>
+                <w:rFonts w:ascii="Libre Franklin" w:cs="Libre Franklin" w:eastAsia="Libre Franklin" w:hAnsi="Libre Franklin"/>
+                <w:color w:val="B9A68F"/>
+                <w:sz w:val="20"/>
+                <w:szCs w:val="20"/>
+              </w:rPr>
+              <w:t xml:space="preserve">	</w:t>
+            </w:r>
+            <w:r>
+              <w:rPr>
+                <w:rFonts w:ascii="Zilla Slab Bold" w:cs="Zilla Slab Bold" w:eastAsia="Zilla Slab Bold" w:hAnsi="Zilla Slab Bold"/>
+                <w:b w:val="false"/>
+                <w:bCs w:val="false"/>
+                <w:color w:val="8A2A2B"/>
+                <w:sz w:val="27"/>
+                <w:szCs w:val="27"/>
+              </w:rPr>
+              <w:t xml:space="preserve">2.50</w:t>
+            </w:r>
+          </w:p>
+          <w:p>
+            <w:pPr>
               <w:keepLines/>
               <w:spacing w:after="110" w:before="0" w:line="240" w:lineRule="auto"/>
             </w:pPr>
@@ -7467,7 +7545,7 @@
                 <w:sz w:val="20"/>
                 <w:szCs w:val="20"/>
               </w:rPr>
-              <w:t xml:space="preserve">Also: coffee and water</w:t>
+              <w:t xml:space="preserve">Also: water</w:t>
             </w:r>
           </w:p>
           <w:p>
@@ -8210,7 +8288,7 @@
     <w:p>
       <w:pPr>
         <w:keepLines/>
-        <w:spacing w:after="0" w:before="900" w:line="240" w:lineRule="auto"/>
+        <w:spacing w:after="0" w:before="160" w:line="240" w:lineRule="auto"/>
       </w:pPr>
       <w:r>
         <w:rPr>

</xml_diff>

<commit_message>
Side swaps: +2, or +4 for sweet potato fries or an appetizer, +5 for loaded baked potato
Sandwich note and burger swap line no longer imply every side swaps for +2.
Regular and seasonal canvas pages, PDFs and the Word file updated.

Co-Authored-By: Claude Opus 5.5 <noreply@anthropic.com>
Claude-Session: https://claude.ai/code/session_01RKLL92XzQ2FsxZ7BA8qdpK
</commit_message>
<xml_diff>
--- a/word/TKB Diner Menu.docx
+++ b/word/TKB Diner Menu.docx
@@ -2832,7 +2832,7 @@
           <w:sz w:val="20"/>
           <w:szCs w:val="20"/>
         </w:rPr>
-        <w:t xml:space="preserve">Served with fries · substitute any side +2</w:t>
+        <w:t xml:space="preserve">Served with fries · swap for another side +2 · sweet potato fries or an appetizer +4 · loaded baked potato +5</w:t>
       </w:r>
     </w:p>
     <w:tbl>
@@ -3608,7 +3608,7 @@
           <w:sz w:val="20"/>
           <w:szCs w:val="20"/>
         </w:rPr>
-        <w:t xml:space="preserve">Served with fries · substitute any side +2</w:t>
+        <w:t xml:space="preserve">Served with fries · swap your fries below</w:t>
       </w:r>
     </w:p>
     <w:p>
@@ -5306,7 +5306,7 @@
           <w:sz w:val="20"/>
           <w:szCs w:val="20"/>
         </w:rPr>
-        <w:t xml:space="preserve">Swap your fries (+2): </w:t>
+        <w:t xml:space="preserve">Swap your fries +2: </w:t>
       </w:r>
       <w:r>
         <w:rPr>
@@ -5317,7 +5317,51 @@
           <w:sz w:val="20"/>
           <w:szCs w:val="20"/>
         </w:rPr>
-        <w:t xml:space="preserve">veggie of the day, baked potato, loaded baked potato, sweet potato fries, mashed potatoes &amp; gravy, side salad, seasonal salad, cup of soup or an appetizer</w:t>
+        <w:t xml:space="preserve">veggie of the day, baked potato, mashed potatoes &amp; gravy, side salad, seasonal salad or cup of soup · </w:t>
+      </w:r>
+      <w:r>
+        <w:rPr>
+          <w:rFonts w:ascii="Libre Franklin SemiBold" w:cs="Libre Franklin SemiBold" w:eastAsia="Libre Franklin SemiBold" w:hAnsi="Libre Franklin SemiBold"/>
+          <w:b w:val="false"/>
+          <w:bCs w:val="false"/>
+          <w:color w:val="2A1E18"/>
+          <w:sz w:val="20"/>
+          <w:szCs w:val="20"/>
+        </w:rPr>
+        <w:t xml:space="preserve">+4: </w:t>
+      </w:r>
+      <w:r>
+        <w:rPr>
+          <w:rFonts w:ascii="Libre Franklin" w:cs="Libre Franklin" w:eastAsia="Libre Franklin" w:hAnsi="Libre Franklin"/>
+          <w:b w:val="false"/>
+          <w:bCs w:val="false"/>
+          <w:color w:val="4E3D31"/>
+          <w:sz w:val="20"/>
+          <w:szCs w:val="20"/>
+        </w:rPr>
+        <w:t xml:space="preserve">sweet potato fries or an appetizer · </w:t>
+      </w:r>
+      <w:r>
+        <w:rPr>
+          <w:rFonts w:ascii="Libre Franklin SemiBold" w:cs="Libre Franklin SemiBold" w:eastAsia="Libre Franklin SemiBold" w:hAnsi="Libre Franklin SemiBold"/>
+          <w:b w:val="false"/>
+          <w:bCs w:val="false"/>
+          <w:color w:val="2A1E18"/>
+          <w:sz w:val="20"/>
+          <w:szCs w:val="20"/>
+        </w:rPr>
+        <w:t xml:space="preserve">+5: </w:t>
+      </w:r>
+      <w:r>
+        <w:rPr>
+          <w:rFonts w:ascii="Libre Franklin" w:cs="Libre Franklin" w:eastAsia="Libre Franklin" w:hAnsi="Libre Franklin"/>
+          <w:b w:val="false"/>
+          <w:bCs w:val="false"/>
+          <w:color w:val="4E3D31"/>
+          <w:sz w:val="20"/>
+          <w:szCs w:val="20"/>
+        </w:rPr>
+        <w:t xml:space="preserve">loaded baked potato</w:t>
       </w:r>
     </w:p>
     <w:p>

</xml_diff>